<commit_message>
Update: centered title header matching 1-print.docx style
</commit_message>
<xml_diff>
--- a/Comparison_San_Juanico_Bhopal_Notes.docx
+++ b/Comparison_San_Juanico_Bhopal_Notes.docx
@@ -4,16 +4,22 @@
   <w:body>
     <w:p>
       <w:pPr>
-        <w:spacing w:after="80"/>
-      </w:pPr>
-      <w:r>
-        <w:rPr>
-          <w:b/>
-          <w:sz w:val="24"/>
+        <w:jc w:val="center"/>
+        <w:spacing w:after="40"/>
+      </w:pPr>
+      <w:r>
+        <w:rPr>
+          <w:b/>
+          <w:sz w:val="28"/>
           <w:color w:val="000000"/>
         </w:rPr>
         <w:t xml:space="preserve">Comparison of San Juanico and Bhopal Gas Disaster</w:t>
       </w:r>
+    </w:p>
+    <w:p>
+      <w:pPr>
+        <w:spacing w:after="40"/>
+      </w:pPr>
     </w:p>
     <w:p>
       <w:pPr>

</xml_diff>